<commit_message>
Entrega 3: estimador con la marca Lumine, informe técnico y plan multi-IA
Rediseño del prototipo con el sistema visual del sitio comercial y Lumine
Habilita; parámetros alineados con la calculadora comercial (bencina a
$1.459/L y días por semana x 4,33); informe técnico con ecuaciones,
ejemplo resuelto, balance de energía, sensibilidad del kit y curvas de
recuperación; plan multi-IA con validador multimodelo; protocolo de
terreno sin costo para estudiantes sin auto.

Co-Authored-By: Claude Opus 5.5 <noreply@anthropic.com>
Claude-Session: https://claude.ai/code/session_01Sm1GEyEEaRYCzcLRpQWvbd
</commit_message>
<xml_diff>
--- a/entrega3/TIG_IA_Grupo01_LumineMotors_Entrega03.docx
+++ b/entrega3/TIG_IA_Grupo01_LumineMotors_Entrega03.docx
@@ -543,7 +543,7 @@
           <w:sz w:val="20"/>
           <w:szCs w:val="20"/>
         </w:rPr>
-        <w:t xml:space="preserve">	13</w:t>
+        <w:t xml:space="preserve">	14</w:t>
       </w:r>
     </w:p>
     <w:p>
@@ -605,7 +605,7 @@
           <w:sz w:val="20"/>
           <w:szCs w:val="20"/>
         </w:rPr>
-        <w:t xml:space="preserve">	15</w:t>
+        <w:t xml:space="preserve">	16</w:t>
       </w:r>
     </w:p>
     <w:p>
@@ -636,7 +636,7 @@
           <w:sz w:val="20"/>
           <w:szCs w:val="20"/>
         </w:rPr>
-        <w:t xml:space="preserve">	17</w:t>
+        <w:t xml:space="preserve">	18</w:t>
       </w:r>
     </w:p>
     <w:p>
@@ -667,7 +667,7 @@
           <w:sz w:val="18"/>
           <w:szCs w:val="18"/>
         </w:rPr>
-        <w:t xml:space="preserve">	17</w:t>
+        <w:t xml:space="preserve">	18</w:t>
       </w:r>
     </w:p>
     <w:p>
@@ -698,7 +698,7 @@
           <w:sz w:val="18"/>
           <w:szCs w:val="18"/>
         </w:rPr>
-        <w:t xml:space="preserve">	19</w:t>
+        <w:t xml:space="preserve">	20</w:t>
       </w:r>
     </w:p>
     <w:p>
@@ -729,7 +729,7 @@
           <w:sz w:val="18"/>
           <w:szCs w:val="18"/>
         </w:rPr>
-        <w:t xml:space="preserve">	20</w:t>
+        <w:t xml:space="preserve">	21</w:t>
       </w:r>
     </w:p>
     <w:p>
@@ -760,7 +760,7 @@
           <w:sz w:val="18"/>
           <w:szCs w:val="18"/>
         </w:rPr>
-        <w:t xml:space="preserve">	21</w:t>
+        <w:t xml:space="preserve">	22</w:t>
       </w:r>
     </w:p>
     <w:p>
@@ -791,7 +791,7 @@
           <w:sz w:val="18"/>
           <w:szCs w:val="18"/>
         </w:rPr>
-        <w:t xml:space="preserve">	21</w:t>
+        <w:t xml:space="preserve">	22</w:t>
       </w:r>
     </w:p>
     <w:p>
@@ -822,7 +822,7 @@
           <w:sz w:val="18"/>
           <w:szCs w:val="18"/>
         </w:rPr>
-        <w:t xml:space="preserve">	22</w:t>
+        <w:t xml:space="preserve">	23</w:t>
       </w:r>
     </w:p>
     <w:p>
@@ -853,7 +853,7 @@
           <w:sz w:val="18"/>
           <w:szCs w:val="18"/>
         </w:rPr>
-        <w:t xml:space="preserve">	25</w:t>
+        <w:t xml:space="preserve">	26</w:t>
       </w:r>
     </w:p>
     <w:p>
@@ -884,7 +884,7 @@
           <w:sz w:val="18"/>
           <w:szCs w:val="18"/>
         </w:rPr>
-        <w:t xml:space="preserve">	26</w:t>
+        <w:t xml:space="preserve">	27</w:t>
       </w:r>
     </w:p>
     <w:p>
@@ -915,7 +915,7 @@
           <w:sz w:val="18"/>
           <w:szCs w:val="18"/>
         </w:rPr>
-        <w:t xml:space="preserve">	26</w:t>
+        <w:t xml:space="preserve">	27</w:t>
       </w:r>
     </w:p>
     <w:p>
@@ -931,7 +931,7 @@
           <w:sz w:val="18"/>
           <w:szCs w:val="18"/>
         </w:rPr>
-        <w:t xml:space="preserve">El cuerpo del informe va de la página 3 a la 14; portada, índice, referencias y anexos no se cuentan en la extensión. Datos reales, secundarios, sintéticos y supuestos se identifican en cada figura y tabla.</w:t>
+        <w:t xml:space="preserve">El cuerpo del informe va de la página 3 a la 15; portada, índice, referencias y anexos no se cuentan en la extensión. Datos reales, secundarios, sintéticos y supuestos se identifican en cada figura y tabla.</w:t>
       </w:r>
     </w:p>
     <w:p>
@@ -1644,7 +1644,7 @@
                 <w:sz w:val="17"/>
                 <w:szCs w:val="17"/>
               </w:rPr>
-              <w:t xml:space="preserve">No cumplido; se reprograma a la Entrega 4 con protocolo y consentimiento</w:t>
+              <w:t xml:space="preserve">No cumplido; se rediseña sin costo (12 viajes registrados como pasajeros) y pasa a la Entrega 4</w:t>
             </w:r>
           </w:p>
         </w:tc>
@@ -1853,7 +1853,7 @@
                 <w:sz w:val="17"/>
                 <w:szCs w:val="17"/>
               </w:rPr>
-              <w:t xml:space="preserve">21 a 26 meses conservadores para colectivos y aplicaciones con el precio supuesto S7</w:t>
+              <w:t xml:space="preserve">22 a 25 meses conservadores para colectivos y aplicaciones con el precio supuesto S7</w:t>
             </w:r>
           </w:p>
         </w:tc>
@@ -2025,7 +2025,7 @@
         <w:rPr>
           <w:rFonts w:ascii="Arial" w:cs="Arial" w:eastAsia="Arial" w:hAnsi="Arial"/>
         </w:rPr>
-        <w:t xml:space="preserve">La propuesta cabe en una frase: decirle a cada conductor cuánto ahorraría él y no cuánto ahorra el mejor caso. Fijémonos en un colectivero que recorre 213 km diarios. Gasta cerca de $852.000 al mes en bencina, con 26 días de trabajo, 10 km/l (supuesto S3) y $1.541 por litro (BioBioChile, 2026); la cifra genérica de 25% le prometería $213.000 mensuales, mientras que el estimador le proyecta $167.000, con un rango de $155.000 a $179.000. La diferencia, $46.000 al mes, es la promesa que la empresa no podría sostener ante el cliente ni ante el SERNAC (Ley N° 19.496, art. 28). Para un conductor de aplicación de 227 km diarios, la sobrepromesa llega a $73.000.</w:t>
+        <w:t xml:space="preserve">La propuesta cabe en una frase: decirle a cada conductor cuánto ahorraría él y no cuánto ahorra el mejor caso. Fijémonos en un colectivero que recorre 213 km diarios. Gasta cerca de $806.000 al mes en bencina, con 6 días por semana, 10 km/l (supuesto S3) y $1.459 por litro (Preciocombustible.cl, 2026); la cifra genérica de 25% le prometería $201.000 mensuales, mientras que el estimador le proyecta $158.000, con un rango de $146.000 a $169.000. La diferencia, $44.000 al mes, es la promesa que la empresa no podría sostener ante el cliente ni ante el SERNAC (Ley N° 19.496, art. 28). Para un conductor de aplicación de 227 km diarios, la sobrepromesa llega a $74.000. El sitio comercial de Lumine ya usa una referencia de 20% con la misma fórmula de gasto (km × días por semana × 4,33 ÷ rendimiento × precio): esa calculadora es el nivel 0 del estimador, una orientación que coincide con la mediana de los colectivos (19,6%) pero sobreestima en 3 a 5 puntos a conductores de aplicación y particulares, por lo que debe derivar al estimador antes de cualquier compromiso.</w:t>
       </w:r>
     </w:p>
     <w:p>
@@ -2980,7 +2980,7 @@
         <w:rPr>
           <w:rFonts w:ascii="Arial" w:cs="Arial" w:eastAsia="Arial" w:hAnsi="Arial"/>
         </w:rPr>
-        <w:t xml:space="preserve">La Tabla 2 resume qué gana cada usuario. El valor para el marketing está en la personalización, la categoría de IA analítica de Huang y Rust (2021), que Kumar et al. (2019) describen como la capacidad de adaptar la oferta a cada cliente con sus propios datos. La salida está pensada para el sesgo que documentan Larrick y Soll (2008): el cliente razona mal en kilómetros por litro, así que la cifra se expresa en pesos al mes y en meses para recuperar la inversión. El estimador también protege ingresos cuando dice que no. Un particular que recorre 25 km diarios ahorraría $13.000 al mes y el kit tardaría más de 48 meses en pagarse; el sistema lo desaconseja, y esa venta perdida evita un reclamo y una mala recomendación. A nivel de cartera, el modelo confirma con datos la prioridad que el TIG dio a los colectivos (Alarcón et al., 2026a): su ahorro mediano es 19,6%, frente a 16,1% en conductores de aplicación y 15,3% en particulares (capítulo 6).</w:t>
+        <w:t xml:space="preserve">La Tabla 2 resume qué gana cada usuario. El valor para el marketing está en la personalización, la categoría de IA analítica de Huang y Rust (2021), que Kumar et al. (2019) describen como la capacidad de adaptar la oferta a cada cliente con sus propios datos. La salida está pensada para el sesgo que documentan Larrick y Soll (2008): el cliente razona mal en kilómetros por litro, así que la cifra se expresa en pesos al mes y en meses para recuperar la inversión. El estimador también protege ingresos cuando dice que no. Un particular que recorre 25 km diarios ahorraría $12.000 al mes y el kit tardaría más de 48 meses en pagarse; el sistema lo desaconseja, y esa venta perdida evita un reclamo y una mala recomendación. A nivel de cartera, el modelo confirma con datos la prioridad que el TIG dio a los colectivos (Alarcón et al., 2026a): su ahorro mediano es 19,6%, frente a 16,1% en conductores de aplicación y 15,3% en particulares (capítulo 6).</w:t>
       </w:r>
     </w:p>
     <w:p>
@@ -6560,7 +6560,7 @@
       <w:r>
         <w:drawing>
           <wp:inline distT="0" distB="0" distL="0" distR="0">
-            <wp:extent cx="4476750" cy="3324225"/>
+            <wp:extent cx="3619500" cy="3371850"/>
             <wp:effectExtent t="0" r="0" b="0" l="0"/>
             <wp:docPr id="1" name="app_diagnostico.png" descr="app_diagnostico.png" title="app_diagnostico.png"/>
             <wp:cNvGraphicFramePr>
@@ -6585,7 +6585,7 @@
                   <pic:spPr bwMode="auto">
                     <a:xfrm>
                       <a:off x="0" y="0"/>
-                      <a:ext cx="4476750" cy="3324225"/>
+                      <a:ext cx="3619500" cy="3371850"/>
                     </a:xfrm>
                     <a:prstGeom prst="rect">
                       <a:avLst/>
@@ -6621,7 +6621,7 @@
           <w:sz w:val="17"/>
           <w:szCs w:val="17"/>
         </w:rPr>
-        <w:t xml:space="preserve">Captura del prototipo (Anexo F). Registro sintético de un colectivo de 213 km diarios; el texto lo generó Claude con el prompt v3.1 y lo aprobó el validador. La vista del técnico y la cotización están en el Anexo F.</w:t>
+        <w:t xml:space="preserve">Captura del prototipo, con la identidad visual del sitio comercial y de Lumine Habilita (Anexo F). Registro sintético de un colectivo de 213 km diarios; el texto lo generó Claude con el prompt v3.1 y lo aprobó el validador. Debajo de la lectura, el prototipo compara la estimación con la referencia de 20% del sitio.</w:t>
       </w:r>
     </w:p>
     <w:p>
@@ -10699,7 +10699,7 @@
         <w:rPr>
           <w:rFonts w:ascii="Arial" w:cs="Arial" w:eastAsia="Arial" w:hAnsi="Arial"/>
         </w:rPr>
-        <w:t xml:space="preserve">El límite de fondo es que el prototipo prueba que el estimador es coherente con la física, no que el kit ahorre lo que el simulador dice; esa brecha solo la cierra la telemetría, y por eso cada estimación queda como línea base. Ante la evidencia inescrutable y las responsabilidades difusas que advierten Mittelstadt et al. (2016), el diseño responde con cifras trazables, un responsable humano por decisión y un registro auditable.</w:t>
+        <w:t xml:space="preserve">El prototipo prueba que el estimador es coherente con la física, no que el kit ahorre lo que el simulador dice; esa brecha la cierra la telemetría. Ante la evidencia inescrutable y las responsabilidades difusas que advierten Mittelstadt et al. (2016), el diseño responde con cifras trazables, un responsable humano por decisión y un registro auditable.</w:t>
       </w:r>
     </w:p>
     <w:p>
@@ -10789,7 +10789,7 @@
         <w:rPr>
           <w:rFonts w:ascii="Arial" w:cs="Arial" w:eastAsia="Arial" w:hAnsi="Arial"/>
         </w:rPr>
-        <w:t xml:space="preserve">La Entrega 4 tiene tres tareas que se desprenden de este prototipo: levantar jornadas reales de conductores de Santiago con el protocolo del Anexo G para recalibrar el modelo y sus intervalos (OE1); medir con un experimento si la estimación personalizada genera más confianza e intención de agendar que la cifra genérica (OE4 y H3); y fijar el umbral de desviación que obligaría a suspender el estimador, junto con la revisión de equidad entre perfiles (OE5).</w:t>
+        <w:t xml:space="preserve">Para la Entrega 4 quedan tres tareas: 12 viajes reales registrados como pasajeros, sin costo, para validar los perfiles (OE1, Anexo G); una encuesta en línea de dos versiones para medir confianza e intención (OE4 y H3); y el umbral de desviación que suspendería el estimador (OE5).</w:t>
       </w:r>
     </w:p>
     <w:p>
@@ -11020,7 +11020,7 @@
           <w:sz w:val="19"/>
           <w:szCs w:val="19"/>
         </w:rPr>
-        <w:t xml:space="preserve">BioBioChile. (2026, 26 de marzo). </w:t>
+        <w:t xml:space="preserve">Brown, T. B., et al. (2020). Language models are few-shot learners. </w:t>
       </w:r>
       <w:r>
         <w:rPr>
@@ -11030,7 +11030,7 @@
           <w:sz w:val="19"/>
           <w:szCs w:val="19"/>
         </w:rPr>
-        <w:t xml:space="preserve">Se concreta histórica alza de combustibles: revisa aquí el precio de gasolinas y diésel</w:t>
+        <w:t xml:space="preserve">Advances in Neural Information Processing Systems, 33</w:t>
       </w:r>
       <w:r>
         <w:rPr>
@@ -11038,7 +11038,7 @@
           <w:sz w:val="19"/>
           <w:szCs w:val="19"/>
         </w:rPr>
-        <w:t xml:space="preserve">.</w:t>
+        <w:t xml:space="preserve">, 1877–1901.</w:t>
       </w:r>
     </w:p>
     <w:p>
@@ -11053,7 +11053,7 @@
           <w:sz w:val="19"/>
           <w:szCs w:val="19"/>
         </w:rPr>
-        <w:t xml:space="preserve">Brown, T. B., et al. (2020). Language models are few-shot learners. </w:t>
+        <w:t xml:space="preserve">Daugherty, P. R., &amp; Wilson, H. J. (2018). </w:t>
       </w:r>
       <w:r>
         <w:rPr>
@@ -11063,7 +11063,7 @@
           <w:sz w:val="19"/>
           <w:szCs w:val="19"/>
         </w:rPr>
-        <w:t xml:space="preserve">Advances in Neural Information Processing Systems, 33</w:t>
+        <w:t xml:space="preserve">Human + machine: Reimagining work in the age of AI</w:t>
       </w:r>
       <w:r>
         <w:rPr>
@@ -11071,7 +11071,7 @@
           <w:sz w:val="19"/>
           <w:szCs w:val="19"/>
         </w:rPr>
-        <w:t xml:space="preserve">, 1877–1901.</w:t>
+        <w:t xml:space="preserve">. Harvard Business Review Press.</w:t>
       </w:r>
     </w:p>
     <w:p>
@@ -11086,7 +11086,7 @@
           <w:sz w:val="19"/>
           <w:szCs w:val="19"/>
         </w:rPr>
-        <w:t xml:space="preserve">Daugherty, P. R., &amp; Wilson, H. J. (2018). </w:t>
+        <w:t xml:space="preserve">Dietvorst, B. J., Simmons, J. P., &amp; Massey, C. (2018). Overcoming algorithm aversion: People will use imperfect algorithms if they can (even slightly) modify them. </w:t>
       </w:r>
       <w:r>
         <w:rPr>
@@ -11096,7 +11096,7 @@
           <w:sz w:val="19"/>
           <w:szCs w:val="19"/>
         </w:rPr>
-        <w:t xml:space="preserve">Human + machine: Reimagining work in the age of AI</w:t>
+        <w:t xml:space="preserve">Management Science, 64</w:t>
       </w:r>
       <w:r>
         <w:rPr>
@@ -11104,7 +11104,7 @@
           <w:sz w:val="19"/>
           <w:szCs w:val="19"/>
         </w:rPr>
-        <w:t xml:space="preserve">. Harvard Business Review Press.</w:t>
+        <w:t xml:space="preserve">(3), 1155–1170. https://doi.org/10.1287/mnsc.2016.2643</w:t>
       </w:r>
     </w:p>
     <w:p>
@@ -11119,7 +11119,7 @@
           <w:sz w:val="19"/>
           <w:szCs w:val="19"/>
         </w:rPr>
-        <w:t xml:space="preserve">Dietvorst, B. J., Simmons, J. P., &amp; Massey, C. (2018). Overcoming algorithm aversion: People will use imperfect algorithms if they can (even slightly) modify them. </w:t>
+        <w:t xml:space="preserve">Dornoff, J., German, J., Deo, A., &amp; Dimaratos, A. (2022). </w:t>
       </w:r>
       <w:r>
         <w:rPr>
@@ -11129,7 +11129,7 @@
           <w:sz w:val="19"/>
           <w:szCs w:val="19"/>
         </w:rPr>
-        <w:t xml:space="preserve">Management Science, 64</w:t>
+        <w:t xml:space="preserve">Mild-hybrid vehicles: A near term technology trend for CO₂ emissions reduction</w:t>
       </w:r>
       <w:r>
         <w:rPr>
@@ -11137,7 +11137,7 @@
           <w:sz w:val="19"/>
           <w:szCs w:val="19"/>
         </w:rPr>
-        <w:t xml:space="preserve">(3), 1155–1170. https://doi.org/10.1287/mnsc.2016.2643</w:t>
+        <w:t xml:space="preserve"> [White paper]. International Council on Clean Transportation. https://theicct.org/wp-content/uploads/2022/07/mild-hybrid-emissions-jul22.pdf</w:t>
       </w:r>
     </w:p>
     <w:p>
@@ -11152,7 +11152,7 @@
           <w:sz w:val="19"/>
           <w:szCs w:val="19"/>
         </w:rPr>
-        <w:t xml:space="preserve">Dornoff, J., German, J., Deo, A., &amp; Dimaratos, A. (2022). </w:t>
+        <w:t xml:space="preserve">Friedman, J. H. (2001). Greedy function approximation: A gradient boosting machine. </w:t>
       </w:r>
       <w:r>
         <w:rPr>
@@ -11162,7 +11162,7 @@
           <w:sz w:val="19"/>
           <w:szCs w:val="19"/>
         </w:rPr>
-        <w:t xml:space="preserve">Mild-hybrid vehicles: A near term technology trend for CO₂ emissions reduction</w:t>
+        <w:t xml:space="preserve">The Annals of Statistics, 29</w:t>
       </w:r>
       <w:r>
         <w:rPr>
@@ -11170,7 +11170,7 @@
           <w:sz w:val="19"/>
           <w:szCs w:val="19"/>
         </w:rPr>
-        <w:t xml:space="preserve"> [White paper]. International Council on Clean Transportation. https://theicct.org/wp-content/uploads/2022/07/mild-hybrid-emissions-jul22.pdf</w:t>
+        <w:t xml:space="preserve">(5), 1189–1232. https://doi.org/10.1214/aos/1013203451</w:t>
       </w:r>
     </w:p>
     <w:p>
@@ -11185,7 +11185,7 @@
           <w:sz w:val="19"/>
           <w:szCs w:val="19"/>
         </w:rPr>
-        <w:t xml:space="preserve">Friedman, J. H. (2001). Greedy function approximation: A gradient boosting machine. </w:t>
+        <w:t xml:space="preserve">Guzzella, L., &amp; Sciarretta, A. (2013). </w:t>
       </w:r>
       <w:r>
         <w:rPr>
@@ -11195,7 +11195,7 @@
           <w:sz w:val="19"/>
           <w:szCs w:val="19"/>
         </w:rPr>
-        <w:t xml:space="preserve">The Annals of Statistics, 29</w:t>
+        <w:t xml:space="preserve">Vehicle propulsion systems: Introduction to modeling and optimization</w:t>
       </w:r>
       <w:r>
         <w:rPr>
@@ -11203,7 +11203,7 @@
           <w:sz w:val="19"/>
           <w:szCs w:val="19"/>
         </w:rPr>
-        <w:t xml:space="preserve">(5), 1189–1232. https://doi.org/10.1214/aos/1013203451</w:t>
+        <w:t xml:space="preserve"> (3.ª ed.). Springer. https://doi.org/10.1007/978-3-642-35913-2</w:t>
       </w:r>
     </w:p>
     <w:p>
@@ -11218,7 +11218,7 @@
           <w:sz w:val="19"/>
           <w:szCs w:val="19"/>
         </w:rPr>
-        <w:t xml:space="preserve">Guzzella, L., &amp; Sciarretta, A. (2013). </w:t>
+        <w:t xml:space="preserve">Hu, X., Liu, T., Qi, X., &amp; Barth, M. (2019). Reinforcement learning for hybrid and plug-in hybrid electric vehicle energy management: Recent advances and prospects. </w:t>
       </w:r>
       <w:r>
         <w:rPr>
@@ -11228,7 +11228,7 @@
           <w:sz w:val="19"/>
           <w:szCs w:val="19"/>
         </w:rPr>
-        <w:t xml:space="preserve">Vehicle propulsion systems: Introduction to modeling and optimization</w:t>
+        <w:t xml:space="preserve">IEEE Industrial Electronics Magazine, 13</w:t>
       </w:r>
       <w:r>
         <w:rPr>
@@ -11236,7 +11236,7 @@
           <w:sz w:val="19"/>
           <w:szCs w:val="19"/>
         </w:rPr>
-        <w:t xml:space="preserve"> (3.ª ed.). Springer. https://doi.org/10.1007/978-3-642-35913-2</w:t>
+        <w:t xml:space="preserve">(3), 16–25. https://doi.org/10.1109/MIE.2019.2913015</w:t>
       </w:r>
     </w:p>
     <w:p>
@@ -11251,7 +11251,7 @@
           <w:sz w:val="19"/>
           <w:szCs w:val="19"/>
         </w:rPr>
-        <w:t xml:space="preserve">Hu, X., Liu, T., Qi, X., &amp; Barth, M. (2019). Reinforcement learning for hybrid and plug-in hybrid electric vehicle energy management: Recent advances and prospects. </w:t>
+        <w:t xml:space="preserve">Huang, M.-H., &amp; Rust, R. T. (2021). A strategic framework for artificial intelligence in marketing. </w:t>
       </w:r>
       <w:r>
         <w:rPr>
@@ -11261,7 +11261,7 @@
           <w:sz w:val="19"/>
           <w:szCs w:val="19"/>
         </w:rPr>
-        <w:t xml:space="preserve">IEEE Industrial Electronics Magazine, 13</w:t>
+        <w:t xml:space="preserve">Journal of the Academy of Marketing Science, 49</w:t>
       </w:r>
       <w:r>
         <w:rPr>
@@ -11269,7 +11269,7 @@
           <w:sz w:val="19"/>
           <w:szCs w:val="19"/>
         </w:rPr>
-        <w:t xml:space="preserve">(3), 16–25. https://doi.org/10.1109/MIE.2019.2913015</w:t>
+        <w:t xml:space="preserve">(1), 30–50. https://doi.org/10.1007/s11747-020-00749-9</w:t>
       </w:r>
     </w:p>
     <w:p>
@@ -11284,7 +11284,7 @@
           <w:sz w:val="19"/>
           <w:szCs w:val="19"/>
         </w:rPr>
-        <w:t xml:space="preserve">Huang, M.-H., &amp; Rust, R. T. (2021). A strategic framework for artificial intelligence in marketing. </w:t>
+        <w:t xml:space="preserve">Ji, Z., Lee, N., Frieske, R., Yu, T., Su, D., Xu, Y., Ishii, E., Bang, Y. J., Madotto, A., &amp; Fung, P. (2023). Survey of hallucination in natural language generation. </w:t>
       </w:r>
       <w:r>
         <w:rPr>
@@ -11294,7 +11294,7 @@
           <w:sz w:val="19"/>
           <w:szCs w:val="19"/>
         </w:rPr>
-        <w:t xml:space="preserve">Journal of the Academy of Marketing Science, 49</w:t>
+        <w:t xml:space="preserve">ACM Computing Surveys, 55</w:t>
       </w:r>
       <w:r>
         <w:rPr>
@@ -11302,7 +11302,7 @@
           <w:sz w:val="19"/>
           <w:szCs w:val="19"/>
         </w:rPr>
-        <w:t xml:space="preserve">(1), 30–50. https://doi.org/10.1007/s11747-020-00749-9</w:t>
+        <w:t xml:space="preserve">(12), Artículo 248. https://doi.org/10.1145/3571730</w:t>
       </w:r>
     </w:p>
     <w:p>
@@ -11317,7 +11317,7 @@
           <w:sz w:val="19"/>
           <w:szCs w:val="19"/>
         </w:rPr>
-        <w:t xml:space="preserve">Ji, Z., Lee, N., Frieske, R., Yu, T., Su, D., Xu, Y., Ishii, E., Bang, Y. J., Madotto, A., &amp; Fung, P. (2023). Survey of hallucination in natural language generation. </w:t>
+        <w:t xml:space="preserve">Kumar, V., Rajan, B., Venkatesan, R., &amp; Lecinski, J. (2019). Understanding the role of artificial intelligence in personalized engagement marketing. </w:t>
       </w:r>
       <w:r>
         <w:rPr>
@@ -11327,7 +11327,7 @@
           <w:sz w:val="19"/>
           <w:szCs w:val="19"/>
         </w:rPr>
-        <w:t xml:space="preserve">ACM Computing Surveys, 55</w:t>
+        <w:t xml:space="preserve">California Management Review, 61</w:t>
       </w:r>
       <w:r>
         <w:rPr>
@@ -11335,7 +11335,7 @@
           <w:sz w:val="19"/>
           <w:szCs w:val="19"/>
         </w:rPr>
-        <w:t xml:space="preserve">(12), Artículo 248. https://doi.org/10.1145/3571730</w:t>
+        <w:t xml:space="preserve">(4), 135–155. https://doi.org/10.1177/0008125619859317</w:t>
       </w:r>
     </w:p>
     <w:p>
@@ -11350,7 +11350,7 @@
           <w:sz w:val="19"/>
           <w:szCs w:val="19"/>
         </w:rPr>
-        <w:t xml:space="preserve">Kumar, V., Rajan, B., Venkatesan, R., &amp; Lecinski, J. (2019). Understanding the role of artificial intelligence in personalized engagement marketing. </w:t>
+        <w:t xml:space="preserve">Larrick, R. P., &amp; Soll, J. B. (2008). The MPG illusion. </w:t>
       </w:r>
       <w:r>
         <w:rPr>
@@ -11360,7 +11360,7 @@
           <w:sz w:val="19"/>
           <w:szCs w:val="19"/>
         </w:rPr>
-        <w:t xml:space="preserve">California Management Review, 61</w:t>
+        <w:t xml:space="preserve">Science, 320</w:t>
       </w:r>
       <w:r>
         <w:rPr>
@@ -11368,7 +11368,7 @@
           <w:sz w:val="19"/>
           <w:szCs w:val="19"/>
         </w:rPr>
-        <w:t xml:space="preserve">(4), 135–155. https://doi.org/10.1177/0008125619859317</w:t>
+        <w:t xml:space="preserve">(5883), 1593–1594. https://doi.org/10.1126/science.1154983</w:t>
       </w:r>
     </w:p>
     <w:p>
@@ -11383,7 +11383,7 @@
           <w:sz w:val="19"/>
           <w:szCs w:val="19"/>
         </w:rPr>
-        <w:t xml:space="preserve">Larrick, R. P., &amp; Soll, J. B. (2008). The MPG illusion. </w:t>
+        <w:t xml:space="preserve">Lewis, P., Perez, E., Piktus, A., Petroni, F., Karpukhin, V., Goyal, N., Küttler, H., Lewis, M., Yih, W., Rocktäschel, T., Riedel, S., &amp; Kiela, D. (2020). Retrieval-augmented generation for knowledge-intensive NLP tasks. </w:t>
       </w:r>
       <w:r>
         <w:rPr>
@@ -11393,7 +11393,7 @@
           <w:sz w:val="19"/>
           <w:szCs w:val="19"/>
         </w:rPr>
-        <w:t xml:space="preserve">Science, 320</w:t>
+        <w:t xml:space="preserve">Advances in Neural Information Processing Systems, 33</w:t>
       </w:r>
       <w:r>
         <w:rPr>
@@ -11401,7 +11401,7 @@
           <w:sz w:val="19"/>
           <w:szCs w:val="19"/>
         </w:rPr>
-        <w:t xml:space="preserve">(5883), 1593–1594. https://doi.org/10.1126/science.1154983</w:t>
+        <w:t xml:space="preserve">, 9459–9474.</w:t>
       </w:r>
     </w:p>
     <w:p>
@@ -11416,7 +11416,37 @@
           <w:sz w:val="19"/>
           <w:szCs w:val="19"/>
         </w:rPr>
-        <w:t xml:space="preserve">Lewis, P., Perez, E., Piktus, A., Petroni, F., Karpukhin, V., Goyal, N., Küttler, H., Lewis, M., Yih, W., Rocktäschel, T., Riedel, S., &amp; Kiela, D. (2020). Retrieval-augmented generation for knowledge-intensive NLP tasks. </w:t>
+        <w:t xml:space="preserve">Ley N° 19.496 de 1997. Establece normas sobre protección de los derechos de los consumidores. Diario Oficial de la República de Chile, 7 de marzo de 1997.</w:t>
+      </w:r>
+    </w:p>
+    <w:p>
+      <w:pPr>
+        <w:spacing w:after="100" w:line="250"/>
+        <w:ind w:left="567" w:hanging="567"/>
+        <w:jc w:val="left"/>
+      </w:pPr>
+      <w:r>
+        <w:rPr>
+          <w:rFonts w:ascii="Arial" w:cs="Arial" w:eastAsia="Arial" w:hAnsi="Arial"/>
+          <w:sz w:val="19"/>
+          <w:szCs w:val="19"/>
+        </w:rPr>
+        <w:t xml:space="preserve">Ley N° 21.719 de 2024. Regula la protección y el tratamiento de los datos personales y crea la Agencia de Protección de Datos Personales. Diario Oficial de la República de Chile, 13 de diciembre de 2024. https://www.bcn.cl/leychile/navegar?idNorma=1209272</w:t>
+      </w:r>
+    </w:p>
+    <w:p>
+      <w:pPr>
+        <w:spacing w:after="100" w:line="250"/>
+        <w:ind w:left="567" w:hanging="567"/>
+        <w:jc w:val="left"/>
+      </w:pPr>
+      <w:r>
+        <w:rPr>
+          <w:rFonts w:ascii="Arial" w:cs="Arial" w:eastAsia="Arial" w:hAnsi="Arial"/>
+          <w:sz w:val="19"/>
+          <w:szCs w:val="19"/>
+        </w:rPr>
+        <w:t xml:space="preserve">Mittelstadt, B. D., Allo, P., Taddeo, M., Wachter, S., &amp; Floridi, L. (2016). The ethics of algorithms: Mapping the debate. </w:t>
       </w:r>
       <w:r>
         <w:rPr>
@@ -11426,7 +11456,7 @@
           <w:sz w:val="19"/>
           <w:szCs w:val="19"/>
         </w:rPr>
-        <w:t xml:space="preserve">Advances in Neural Information Processing Systems, 33</w:t>
+        <w:t xml:space="preserve">Big Data &amp; Society, 3</w:t>
       </w:r>
       <w:r>
         <w:rPr>
@@ -11434,7 +11464,7 @@
           <w:sz w:val="19"/>
           <w:szCs w:val="19"/>
         </w:rPr>
-        <w:t xml:space="preserve">, 9459–9474.</w:t>
+        <w:t xml:space="preserve">(2). https://doi.org/10.1177/2053951716679679</w:t>
       </w:r>
     </w:p>
     <w:p>
@@ -11449,37 +11479,7 @@
           <w:sz w:val="19"/>
           <w:szCs w:val="19"/>
         </w:rPr>
-        <w:t xml:space="preserve">Ley N° 19.496 de 1997. Establece normas sobre protección de los derechos de los consumidores. Diario Oficial de la República de Chile, 7 de marzo de 1997.</w:t>
-      </w:r>
-    </w:p>
-    <w:p>
-      <w:pPr>
-        <w:spacing w:after="100" w:line="250"/>
-        <w:ind w:left="567" w:hanging="567"/>
-        <w:jc w:val="left"/>
-      </w:pPr>
-      <w:r>
-        <w:rPr>
-          <w:rFonts w:ascii="Arial" w:cs="Arial" w:eastAsia="Arial" w:hAnsi="Arial"/>
-          <w:sz w:val="19"/>
-          <w:szCs w:val="19"/>
-        </w:rPr>
-        <w:t xml:space="preserve">Ley N° 21.719 de 2024. Regula la protección y el tratamiento de los datos personales y crea la Agencia de Protección de Datos Personales. Diario Oficial de la República de Chile, 13 de diciembre de 2024. https://www.bcn.cl/leychile/navegar?idNorma=1209272</w:t>
-      </w:r>
-    </w:p>
-    <w:p>
-      <w:pPr>
-        <w:spacing w:after="100" w:line="250"/>
-        <w:ind w:left="567" w:hanging="567"/>
-        <w:jc w:val="left"/>
-      </w:pPr>
-      <w:r>
-        <w:rPr>
-          <w:rFonts w:ascii="Arial" w:cs="Arial" w:eastAsia="Arial" w:hAnsi="Arial"/>
-          <w:sz w:val="19"/>
-          <w:szCs w:val="19"/>
-        </w:rPr>
-        <w:t xml:space="preserve">Mittelstadt, B. D., Allo, P., Taddeo, M., Wachter, S., &amp; Floridi, L. (2016). The ethics of algorithms: Mapping the debate. </w:t>
+        <w:t xml:space="preserve">National Renewable Energy Laboratory [NREL]. (s.f.). </w:t>
       </w:r>
       <w:r>
         <w:rPr>
@@ -11489,7 +11489,7 @@
           <w:sz w:val="19"/>
           <w:szCs w:val="19"/>
         </w:rPr>
-        <w:t xml:space="preserve">Big Data &amp; Society, 3</w:t>
+        <w:t xml:space="preserve">2007 Chicago Regional Household Travel Inventory</w:t>
       </w:r>
       <w:r>
         <w:rPr>
@@ -11497,7 +11497,7 @@
           <w:sz w:val="19"/>
           <w:szCs w:val="19"/>
         </w:rPr>
-        <w:t xml:space="preserve">(2). https://doi.org/10.1177/2053951716679679</w:t>
+        <w:t xml:space="preserve"> [Conjunto de datos]. Transportation Secure Data Center. https://www.nrel.gov/transportation/secure-transportation-data/tsdc-chicago-household-travel-inventory</w:t>
       </w:r>
     </w:p>
     <w:p>
@@ -11512,7 +11512,7 @@
           <w:sz w:val="19"/>
           <w:szCs w:val="19"/>
         </w:rPr>
-        <w:t xml:space="preserve">National Renewable Energy Laboratory [NREL]. (s.f.). </w:t>
+        <w:t xml:space="preserve">National Renewable Energy Laboratory [NREL]. (2026). </w:t>
       </w:r>
       <w:r>
         <w:rPr>
@@ -11522,7 +11522,7 @@
           <w:sz w:val="19"/>
           <w:szCs w:val="19"/>
         </w:rPr>
-        <w:t xml:space="preserve">2007 Chicago Regional Household Travel Inventory</w:t>
+        <w:t xml:space="preserve">FASTSim: Future Automotive Systems Technology Simulator</w:t>
       </w:r>
       <w:r>
         <w:rPr>
@@ -11530,7 +11530,7 @@
           <w:sz w:val="19"/>
           <w:szCs w:val="19"/>
         </w:rPr>
-        <w:t xml:space="preserve"> [Conjunto de datos]. Transportation Secure Data Center. https://www.nrel.gov/transportation/secure-transportation-data/tsdc-chicago-household-travel-inventory</w:t>
+        <w:t xml:space="preserve"> (rama fastsim-2, versión 2.1.5) [Software y ciclos de conducción]. GitHub. https://github.com/NREL/fastsim</w:t>
       </w:r>
     </w:p>
     <w:p>
@@ -11545,7 +11545,7 @@
           <w:sz w:val="19"/>
           <w:szCs w:val="19"/>
         </w:rPr>
-        <w:t xml:space="preserve">National Renewable Energy Laboratory [NREL]. (2026). </w:t>
+        <w:t xml:space="preserve">Pedregosa, F., Varoquaux, G., Gramfort, A., Michel, V., Thirion, B., Grisel, O., Blondel, M., Prettenhofer, P., Weiss, R., Dubourg, V., Vanderplas, J., Passos, A., Cournapeau, D., Brucher, M., Perrot, M., &amp; Duchesnay, É. (2011). Scikit-learn: Machine learning in Python. </w:t>
       </w:r>
       <w:r>
         <w:rPr>
@@ -11555,7 +11555,7 @@
           <w:sz w:val="19"/>
           <w:szCs w:val="19"/>
         </w:rPr>
-        <w:t xml:space="preserve">FASTSim: Future Automotive Systems Technology Simulator</w:t>
+        <w:t xml:space="preserve">Journal of Machine Learning Research, 12</w:t>
       </w:r>
       <w:r>
         <w:rPr>
@@ -11563,7 +11563,7 @@
           <w:sz w:val="19"/>
           <w:szCs w:val="19"/>
         </w:rPr>
-        <w:t xml:space="preserve"> (rama fastsim-2, versión 2.1.5) [Software y ciclos de conducción]. GitHub. https://github.com/NREL/fastsim</w:t>
+        <w:t xml:space="preserve">, 2825–2830.</w:t>
       </w:r>
     </w:p>
     <w:p>
@@ -11578,7 +11578,7 @@
           <w:sz w:val="19"/>
           <w:szCs w:val="19"/>
         </w:rPr>
-        <w:t xml:space="preserve">Pedregosa, F., Varoquaux, G., Gramfort, A., Michel, V., Thirion, B., Grisel, O., Blondel, M., Prettenhofer, P., Weiss, R., Dubourg, V., Vanderplas, J., Passos, A., Cournapeau, D., Brucher, M., Perrot, M., &amp; Duchesnay, É. (2011). Scikit-learn: Machine learning in Python. </w:t>
+        <w:t xml:space="preserve">Preciocombustible.cl. (2026). </w:t>
       </w:r>
       <w:r>
         <w:rPr>
@@ -11588,7 +11588,7 @@
           <w:sz w:val="19"/>
           <w:szCs w:val="19"/>
         </w:rPr>
-        <w:t xml:space="preserve">Journal of Machine Learning Research, 12</w:t>
+        <w:t xml:space="preserve">Precio bencina en Metropolitana de Santiago hoy</w:t>
       </w:r>
       <w:r>
         <w:rPr>
@@ -11596,7 +11596,7 @@
           <w:sz w:val="19"/>
           <w:szCs w:val="19"/>
         </w:rPr>
-        <w:t xml:space="preserve">, 2825–2830.</w:t>
+        <w:t xml:space="preserve"> [Promedio regional de la bencina de 93 octanos, consultado el 30 de septiembre de 2026]. https://preciocombustible.cl/region/metropolitana/</w:t>
       </w:r>
     </w:p>
     <w:p>
@@ -15375,7 +15375,7 @@
           <w:sz w:val="15"/>
           <w:szCs w:val="15"/>
         </w:rPr>
-        <w:t xml:space="preserve">En cuanto al ahorro, según tu registro ahorrarías un 19,6% de combustible (entre 18,2% y 21,0%), unos $167.000 al mes, y recuperarías la inversión en 21 meses en el escenario conservador.</w:t>
+        <w:t xml:space="preserve">En cuanto al ahorro, según tu registro ahorrarías un 19,6% de combustible (entre 18,2% y 21,0%), unos $158.000 al mes, y recuperarías la inversión en 22 meses en el escenario conservador.</w:t>
       </w:r>
     </w:p>
     <w:p>
@@ -15440,7 +15440,7 @@
           <w:sz w:val="15"/>
           <w:szCs w:val="15"/>
         </w:rPr>
-        <w:t xml:space="preserve">Según tu registro estimamos un ahorro de combustible de 19,6%, con un rango probable de 18,2% a 21,0%. Son unos $167.000 al mes (rango: $155.000 a $179.000), y con el escenario conservador recuperarías la inversión en 21 meses.</w:t>
+        <w:t xml:space="preserve">Según tu registro estimamos un ahorro de combustible de 19,6%, con un rango probable de 18,2% a 21,0%. Son unos $158.000 al mes (rango: $146.000 a $169.000), y con el escenario conservador recuperarías la inversión en 22 meses.</w:t>
       </w:r>
     </w:p>
     <w:p>
@@ -15552,7 +15552,7 @@
           <w:sz w:val="15"/>
           <w:szCs w:val="15"/>
         </w:rPr>
-        <w:t xml:space="preserve">Con tus datos, estimamos un ahorro de 15,7% en combustible (rango probable: 14,0% a 17,4%), unos $13.000 al mes.</w:t>
+        <w:t xml:space="preserve">Con tus datos, estimamos un ahorro de 15,7% en combustible (rango probable: 14,0% a 17,4%), unos $12.000 al mes.</w:t>
       </w:r>
     </w:p>
     <w:p>
@@ -15651,7 +15651,7 @@
           <w:sz w:val="15"/>
           <w:szCs w:val="15"/>
         </w:rPr>
-        <w:t xml:space="preserve">Con tus datos estimamos un ahorro de combustible de 15,7%, con un rango probable de 14,0% a 17,4%. Son unos $13.000 al mes (rango: $12.000 a $15.000).</w:t>
+        <w:t xml:space="preserve">Con tus datos estimamos un ahorro de combustible de 15,7%, con un rango probable de 14,0% a 17,4%. Son unos $12.000 al mes (rango: $11.000 a $14.000).</w:t>
       </w:r>
     </w:p>
     <w:p>
@@ -20332,7 +20332,7 @@
       <w:r>
         <w:drawing>
           <wp:inline distT="0" distB="0" distL="0" distR="0">
-            <wp:extent cx="4953000" cy="3409950"/>
+            <wp:extent cx="4953000" cy="4419600"/>
             <wp:effectExtent t="0" r="0" b="0" l="0"/>
             <wp:docPr id="1" name="app_cotizacion.png" descr="app_cotizacion.png" title="app_cotizacion.png"/>
             <wp:cNvGraphicFramePr>
@@ -20357,7 +20357,7 @@
                   <pic:spPr bwMode="auto">
                     <a:xfrm>
                       <a:off x="0" y="0"/>
-                      <a:ext cx="4953000" cy="3409950"/>
+                      <a:ext cx="4953000" cy="4419600"/>
                     </a:xfrm>
                     <a:prstGeom prst="rect">
                       <a:avLst/>
@@ -20439,7 +20439,7 @@
       <w:r>
         <w:drawing>
           <wp:inline distT="0" distB="0" distL="0" distR="0">
-            <wp:extent cx="4953000" cy="4333875"/>
+            <wp:extent cx="4953000" cy="4419600"/>
             <wp:effectExtent t="0" r="0" b="0" l="0"/>
             <wp:docPr id="1" name="app_tecnico.png" descr="app_tecnico.png" title="app_tecnico.png"/>
             <wp:cNvGraphicFramePr>
@@ -20464,7 +20464,7 @@
                   <pic:spPr bwMode="auto">
                     <a:xfrm>
                       <a:off x="0" y="0"/>
-                      <a:ext cx="4953000" cy="4333875"/>
+                      <a:ext cx="4953000" cy="4419600"/>
                     </a:xfrm>
                     <a:prstGeom prst="rect">
                       <a:avLst/>
@@ -20546,7 +20546,7 @@
       <w:r>
         <w:drawing>
           <wp:inline distT="0" distB="0" distL="0" distR="0">
-            <wp:extent cx="4953000" cy="3409950"/>
+            <wp:extent cx="4953000" cy="4419600"/>
             <wp:effectExtent t="0" r="0" b="0" l="0"/>
             <wp:docPr id="1" name="app_no_aplica.png" descr="app_no_aplica.png" title="app_no_aplica.png"/>
             <wp:cNvGraphicFramePr>
@@ -20571,7 +20571,7 @@
                   <pic:spPr bwMode="auto">
                     <a:xfrm>
                       <a:off x="0" y="0"/>
-                      <a:ext cx="4953000" cy="3409950"/>
+                      <a:ext cx="4953000" cy="4419600"/>
                     </a:xfrm>
                     <a:prstGeom prst="rect">
                       <a:avLst/>
@@ -20632,7 +20632,7 @@
         <w:rPr>
           <w:rFonts w:ascii="Arial" w:cs="Arial" w:eastAsia="Arial" w:hAnsi="Arial"/>
         </w:rPr>
-        <w:t xml:space="preserve">Este protocolo reemplaza el OE1 de la Entrega 3 y se ejecutará en la Entrega 4.</w:t>
+        <w:t xml:space="preserve">El protocolo original suponía acceso a autos y adaptadores OBD. Como ninguno de los tres integrantes tiene auto ni presupuesto, se rediseñó para que cueste cero pesos y use solo celulares y trayectos que el grupo ya hace. Reemplaza el OE1 y se ejecuta en la Entrega 4.</w:t>
       </w:r>
     </w:p>
     <w:p>
@@ -20651,13 +20651,13 @@
           <w:b/>
           <w:bCs/>
         </w:rPr>
-        <w:t xml:space="preserve">Participantes.</w:t>
-      </w:r>
-      <w:r>
-        <w:rPr>
-          <w:rFonts w:ascii="Arial" w:cs="Arial" w:eastAsia="Arial" w:hAnsi="Arial"/>
-        </w:rPr>
-        <w:t xml:space="preserve"> Al menos 5 conductores (meta de 10) contactados por medio de los entrevistados del TIG y de gremios de colectiveros, con al menos dos colectiveros y dos conductores de aplicación.</w:t>
+        <w:t xml:space="preserve">Registro como pasajero.</w:t>
+      </w:r>
+      <w:r>
+        <w:rPr>
+          <w:rFonts w:ascii="Arial" w:cs="Arial" w:eastAsia="Arial" w:hAnsi="Arial"/>
+        </w:rPr>
+        <w:t xml:space="preserve"> Cada integrante registra con su celular los viajes que ya hace en colectivo, auto de aplicación o auto de un familiar, con la aplicación gratuita phyphox (RWTH Aachen, experimento “Ubicación GPS”, exporta CSV) o GPS Logger en Android. Meta: 12 viajes de al menos 5 km, cuatro por integrante y al menos seis en colectivo. El conductor no participa del registro: solo se mide la velocidad del vehículo en que viaja el estudiante.</w:t>
       </w:r>
     </w:p>
     <w:p>
@@ -20676,13 +20676,13 @@
           <w:b/>
           <w:bCs/>
         </w:rPr>
-        <w:t xml:space="preserve">Consentimiento.</w:t>
-      </w:r>
-      <w:r>
-        <w:rPr>
-          <w:rFonts w:ascii="Arial" w:cs="Arial" w:eastAsia="Arial" w:hAnsi="Arial"/>
-        </w:rPr>
-        <w:t xml:space="preserve"> Documento escrito que explica qué se registra, para qué, cuánto tiempo se guarda y cómo retirarse; consentimiento específico para la geolocalización, como exige la Ley N° 21.719.</w:t>
+        <w:t xml:space="preserve">Costo.</w:t>
+      </w:r>
+      <w:r>
+        <w:rPr>
+          <w:rFonts w:ascii="Arial" w:cs="Arial" w:eastAsia="Arial" w:hAnsi="Arial"/>
+        </w:rPr>
+        <w:t xml:space="preserve"> Cero si se registran los trayectos habituales a la universidad; a lo sumo el valor de dos o tres pasajes de colectivo por integrante.</w:t>
       </w:r>
     </w:p>
     <w:p>
@@ -20701,13 +20701,13 @@
           <w:b/>
           <w:bCs/>
         </w:rPr>
-        <w:t xml:space="preserve">Registro.</w:t>
-      </w:r>
-      <w:r>
-        <w:rPr>
-          <w:rFonts w:ascii="Arial" w:cs="Arial" w:eastAsia="Arial" w:hAnsi="Arial"/>
-        </w:rPr>
-        <w:t xml:space="preserve"> Aplicación gratuita de registro GPS a 1 Hz con exportación a CSV o GPX durante cinco jornadas de trabajo; si el auto lo permite, un adaptador OBD-II para medir el flujo de combustible.</w:t>
+        <w:t xml:space="preserve">Consentimiento y privacidad.</w:t>
+      </w:r>
+      <w:r>
+        <w:rPr>
+          <w:rFonts w:ascii="Arial" w:cs="Arial" w:eastAsia="Arial" w:hAnsi="Arial"/>
+        </w:rPr>
+        <w:t xml:space="preserve"> El estudiante registra su propio trayecto; no se registran datos del conductor ni de otros pasajeros. Antes de analizar se recortan 300 m al inicio y al final y se guardan solo las variables agregadas.</w:t>
       </w:r>
     </w:p>
     <w:p>
@@ -20726,13 +20726,13 @@
           <w:b/>
           <w:bCs/>
         </w:rPr>
-        <w:t xml:space="preserve">Validez.</w:t>
-      </w:r>
-      <w:r>
-        <w:rPr>
-          <w:rFonts w:ascii="Arial" w:cs="Arial" w:eastAsia="Arial" w:hAnsi="Arial"/>
-        </w:rPr>
-        <w:t xml:space="preserve"> Jornadas de al menos 10 km y menos de 5% de datos perdidos; se descartan tramos a pie o en otro vehículo (velocidad máxima bajo 20 km/h durante más de 10 minutos).</w:t>
+        <w:t xml:space="preserve">Uso de los datos.</w:t>
+      </w:r>
+      <w:r>
+        <w:rPr>
+          <w:rFonts w:ascii="Arial" w:cs="Arial" w:eastAsia="Arial" w:hAnsi="Arial"/>
+        </w:rPr>
+        <w:t xml:space="preserve"> No se entrena el modelo con 12 viajes: se comparan sus variables (detenciones por km, velocidad, tiempo detenido) con las de los microviajes sintéticos para validar los perfiles, y se calcula el ahorro simulado de cada viaje real. El prototipo ya acepta estos archivos en la pestaña de diagnóstico.</w:t>
       </w:r>
     </w:p>
     <w:p>
@@ -20751,38 +20751,13 @@
           <w:b/>
           <w:bCs/>
         </w:rPr>
-        <w:t xml:space="preserve">Privacidad.</w:t>
-      </w:r>
-      <w:r>
-        <w:rPr>
-          <w:rFonts w:ascii="Arial" w:cs="Arial" w:eastAsia="Arial" w:hAnsi="Arial"/>
-        </w:rPr>
-        <w:t xml:space="preserve"> Recorte automático de los primeros y últimos 300 m de cada viaje, cálculo de variables agregadas en el equipo del proyecto y borrado de las trazas crudas en 30 días.</w:t>
-      </w:r>
-    </w:p>
-    <w:p>
-      <w:pPr>
-        <w:pStyle w:val="ListParagraph"/>
-        <w:numPr>
-          <w:ilvl w:val="0"/>
-          <w:numId w:val="3"/>
-        </w:numPr>
-        <w:spacing w:after="70" w:line="260"/>
-        <w:jc w:val="both"/>
-      </w:pPr>
-      <w:r>
-        <w:rPr>
-          <w:rFonts w:ascii="Arial" w:cs="Arial" w:eastAsia="Arial" w:hAnsi="Arial"/>
-          <w:b/>
-          <w:bCs/>
-        </w:rPr>
-        <w:t xml:space="preserve">Uso.</w:t>
-      </w:r>
-      <w:r>
-        <w:rPr>
-          <w:rFonts w:ascii="Arial" w:cs="Arial" w:eastAsia="Arial" w:hAnsi="Arial"/>
-        </w:rPr>
-        <w:t xml:space="preserve"> Comparar las variables reales con los perfiles sintéticos, recalibrar el intervalo del modelo y, si hay OBD, contrastar el consumo base simulado con el medido.</w:t>
+        <w:t xml:space="preserve">Encuesta de la Entrega 4 (OE4).</w:t>
+      </w:r>
+      <w:r>
+        <w:rPr>
+          <w:rFonts w:ascii="Arial" w:cs="Arial" w:eastAsia="Arial" w:hAnsi="Arial"/>
+        </w:rPr>
+        <w:t xml:space="preserve"> Formulario en línea con dos versiones al azar (cifra genérica frente a estimación con intervalo), difundido por WhatsApp e Instagram en grupos de colectiveros, conductores de aplicación, familiares y compañeros con auto; más una visita de dos horas a un terminal de colectivos con un código QR. Meta realista de 40 respuestas, declarando que la muestra no es aleatoria.</w:t>
       </w:r>
     </w:p>
     <w:p>
@@ -21371,7 +21346,7 @@
                 <w:sz w:val="17"/>
                 <w:szCs w:val="17"/>
               </w:rPr>
-              <w:t xml:space="preserve">Cifras de tránsito de Santiago (TomTom) y altitud de la ciudad</w:t>
+              <w:t xml:space="preserve">Cifras de tránsito de Santiago (TomTom), altitud de la ciudad y precio de la bencina</w:t>
             </w:r>
           </w:p>
         </w:tc>
@@ -21404,6 +21379,145 @@
                 <w:szCs w:val="17"/>
               </w:rPr>
               <w:t xml:space="preserve">Contraste con la fuente original citada</w:t>
+            </w:r>
+          </w:p>
+        </w:tc>
+      </w:tr>
+      <w:tr>
+        <w:trPr>
+          <w:cantSplit/>
+        </w:trPr>
+        <w:tc>
+          <w:tcPr>
+            <w:tcW w:type="dxa" w:w="1200"/>
+            <w:tcBorders>
+              <w:top w:val="single" w:color="C9D1DB" w:sz="4"/>
+              <w:left w:val="single" w:color="C9D1DB" w:sz="4"/>
+              <w:bottom w:val="single" w:color="C9D1DB" w:sz="4"/>
+              <w:right w:val="single" w:color="C9D1DB" w:sz="4"/>
+            </w:tcBorders>
+            <w:shd w:fill="F3F6FA" w:color="auto" w:val="clear"/>
+            <w:tcMar>
+              <w:top w:type="dxa" w:w="50"/>
+              <w:left w:type="dxa" w:w="80"/>
+              <w:bottom w:type="dxa" w:w="50"/>
+              <w:right w:type="dxa" w:w="80"/>
+            </w:tcMar>
+            <w:vAlign w:val="center"/>
+          </w:tcPr>
+          <w:p>
+            <w:pPr>
+              <w:spacing w:after="0" w:line="230"/>
+              <w:jc w:val="left"/>
+            </w:pPr>
+            <w:r>
+              <w:rPr>
+                <w:rFonts w:ascii="Arial" w:cs="Arial" w:eastAsia="Arial" w:hAnsi="Arial"/>
+                <w:b/>
+                <w:bCs/>
+                <w:sz w:val="17"/>
+                <w:szCs w:val="17"/>
+              </w:rPr>
+              <w:t xml:space="preserve">Plan (Entregas 3 a 5)</w:t>
+            </w:r>
+          </w:p>
+        </w:tc>
+        <w:tc>
+          <w:tcPr>
+            <w:tcW w:type="dxa" w:w="2000"/>
+            <w:tcBorders>
+              <w:top w:val="single" w:color="C9D1DB" w:sz="4"/>
+              <w:left w:val="single" w:color="C9D1DB" w:sz="4"/>
+              <w:bottom w:val="single" w:color="C9D1DB" w:sz="4"/>
+              <w:right w:val="single" w:color="C9D1DB" w:sz="4"/>
+            </w:tcBorders>
+            <w:shd w:fill="F3F6FA" w:color="auto" w:val="clear"/>
+            <w:tcMar>
+              <w:top w:type="dxa" w:w="50"/>
+              <w:left w:type="dxa" w:w="80"/>
+              <w:bottom w:type="dxa" w:w="50"/>
+              <w:right w:type="dxa" w:w="80"/>
+            </w:tcMar>
+            <w:vAlign w:val="center"/>
+          </w:tcPr>
+          <w:p>
+            <w:pPr>
+              <w:spacing w:after="0" w:line="230"/>
+              <w:jc w:val="left"/>
+            </w:pPr>
+            <w:r>
+              <w:rPr>
+                <w:rFonts w:ascii="Arial" w:cs="Arial" w:eastAsia="Arial" w:hAnsi="Arial"/>
+                <w:sz w:val="17"/>
+                <w:szCs w:val="17"/>
+              </w:rPr>
+              <w:t xml:space="preserve">ChatGPT, Gemini, DeepSeek, Grok y Canva</w:t>
+            </w:r>
+          </w:p>
+        </w:tc>
+        <w:tc>
+          <w:tcPr>
+            <w:tcW w:type="dxa" w:w="3080"/>
+            <w:tcBorders>
+              <w:top w:val="single" w:color="C9D1DB" w:sz="4"/>
+              <w:left w:val="single" w:color="C9D1DB" w:sz="4"/>
+              <w:bottom w:val="single" w:color="C9D1DB" w:sz="4"/>
+              <w:right w:val="single" w:color="C9D1DB" w:sz="4"/>
+            </w:tcBorders>
+            <w:shd w:fill="F3F6FA" w:color="auto" w:val="clear"/>
+            <w:tcMar>
+              <w:top w:type="dxa" w:w="50"/>
+              <w:left w:type="dxa" w:w="80"/>
+              <w:bottom w:type="dxa" w:w="50"/>
+              <w:right w:type="dxa" w:w="80"/>
+            </w:tcMar>
+            <w:vAlign w:val="center"/>
+          </w:tcPr>
+          <w:p>
+            <w:pPr>
+              <w:spacing w:after="0" w:line="230"/>
+              <w:jc w:val="left"/>
+            </w:pPr>
+            <w:r>
+              <w:rPr>
+                <w:rFonts w:ascii="Arial" w:cs="Arial" w:eastAsia="Arial" w:hAnsi="Arial"/>
+                <w:sz w:val="17"/>
+                <w:szCs w:val="17"/>
+              </w:rPr>
+              <w:t xml:space="preserve">Auditoría cruzada del código y de las fórmulas, batería RAFA en otros modelos, ataque a las instrucciones y material visual</w:t>
+            </w:r>
+          </w:p>
+        </w:tc>
+        <w:tc>
+          <w:tcPr>
+            <w:tcW w:type="dxa" w:w="3080"/>
+            <w:tcBorders>
+              <w:top w:val="single" w:color="C9D1DB" w:sz="4"/>
+              <w:left w:val="single" w:color="C9D1DB" w:sz="4"/>
+              <w:bottom w:val="single" w:color="C9D1DB" w:sz="4"/>
+              <w:right w:val="single" w:color="C9D1DB" w:sz="4"/>
+            </w:tcBorders>
+            <w:shd w:fill="F3F6FA" w:color="auto" w:val="clear"/>
+            <w:tcMar>
+              <w:top w:type="dxa" w:w="50"/>
+              <w:left w:type="dxa" w:w="80"/>
+              <w:bottom w:type="dxa" w:w="50"/>
+              <w:right w:type="dxa" w:w="80"/>
+            </w:tcMar>
+            <w:vAlign w:val="center"/>
+          </w:tcPr>
+          <w:p>
+            <w:pPr>
+              <w:spacing w:after="0" w:line="230"/>
+              <w:jc w:val="left"/>
+            </w:pPr>
+            <w:r>
+              <w:rPr>
+                <w:rFonts w:ascii="Arial" w:cs="Arial" w:eastAsia="Arial" w:hAnsi="Arial"/>
+                <w:sz w:val="17"/>
+                <w:szCs w:val="17"/>
+              </w:rPr>
+              <w:t xml:space="preserve">Documento aparte “Plan multi-IA”: cada salida se registra y se califica con el mismo validador</w:t>
             </w:r>
           </w:p>
         </w:tc>
@@ -22201,7 +22315,7 @@
                 <w:sz w:val="17"/>
                 <w:szCs w:val="17"/>
               </w:rPr>
-              <w:t xml:space="preserve">Se usa para el plazo, marcado como supuesto</w:t>
+              <w:t xml:space="preserve">Se usa para el plazo, marcado como supuesto; bencina a $1.459/L y días por semana × 4,33, igual que el sitio comercial</w:t>
             </w:r>
           </w:p>
         </w:tc>

</xml_diff>